<commit_message>
docs: rebuild contextual action guides
</commit_message>
<xml_diff>
--- a/Документация/Инструкция охранника/Инструкция охранника.docx
+++ b/Документация/Инструкция охранника/Инструкция охранника.docx
@@ -157,7 +157,7 @@
           <w:color w:val="000000"/>
           <w:sz w:val="26"/>
         </w:rPr>
-        <w:t>Версия документа: 1.4</w:t>
+        <w:t>Версия документа: 1.5</w:t>
       </w:r>
     </w:p>
     <w:p>
@@ -3786,6 +3786,58 @@
       </w:r>
     </w:p>
     <w:p>
+      <w:r>
+        <w:rPr>
+          <w:rFonts w:ascii="Times New Roman" w:hAnsi="Times New Roman" w:cs="Times New Roman" w:eastAsia="Times New Roman"/>
+          <w:b w:val="0"/>
+          <w:i w:val="0"/>
+          <w:color w:val="000000"/>
+          <w:sz w:val="28"/>
+        </w:rPr>
+        <w:t xml:space="preserve">Если для вашего поста выдан доступ к журналу, нажмите </w:t>
+      </w:r>
+      <w:r>
+        <w:rPr>
+          <w:rFonts w:ascii="Times New Roman" w:hAnsi="Times New Roman" w:cs="Times New Roman" w:eastAsia="Times New Roman"/>
+          <w:b/>
+          <w:i w:val="0"/>
+          <w:color w:val="000000"/>
+          <w:sz w:val="28"/>
+        </w:rPr>
+        <w:t>«История»</w:t>
+      </w:r>
+      <w:r>
+        <w:rPr>
+          <w:rFonts w:ascii="Times New Roman" w:hAnsi="Times New Roman" w:cs="Times New Roman" w:eastAsia="Times New Roman"/>
+          <w:b w:val="0"/>
+          <w:i w:val="0"/>
+          <w:color w:val="000000"/>
+          <w:sz w:val="28"/>
+        </w:rPr>
+        <w:t xml:space="preserve">, чтобы посмотреть проходы или проезды этого поста. На узком экране команда находится в </w:t>
+      </w:r>
+      <w:r>
+        <w:rPr>
+          <w:rFonts w:ascii="Times New Roman" w:hAnsi="Times New Roman" w:cs="Times New Roman" w:eastAsia="Times New Roman"/>
+          <w:b/>
+          <w:i w:val="0"/>
+          <w:color w:val="000000"/>
+          <w:sz w:val="28"/>
+        </w:rPr>
+        <w:t>«⋯»</w:t>
+      </w:r>
+      <w:r>
+        <w:rPr>
+          <w:rFonts w:ascii="Times New Roman" w:hAnsi="Times New Roman" w:cs="Times New Roman" w:eastAsia="Times New Roman"/>
+          <w:b w:val="0"/>
+          <w:i w:val="0"/>
+          <w:color w:val="000000"/>
+          <w:sz w:val="28"/>
+        </w:rPr>
+        <w:t xml:space="preserve"> внутреннего списка. Не путайте журнал поста с карточкой отдельной записи или историей заявки.</w:t>
+      </w:r>
+    </w:p>
+    <w:p>
       <w:pPr>
         <w:keepNext/>
         <w:spacing w:before="120" w:after="40"/>
@@ -4889,6 +4941,98 @@
           <w:sz w:val="24"/>
         </w:rPr>
         <w:t>Рисунок 3.12 — Состав заявки</w:t>
+      </w:r>
+    </w:p>
+    <w:p>
+      <w:r>
+        <w:rPr>
+          <w:rFonts w:ascii="Times New Roman" w:hAnsi="Times New Roman" w:cs="Times New Roman" w:eastAsia="Times New Roman"/>
+          <w:b w:val="0"/>
+          <w:i w:val="0"/>
+          <w:color w:val="000000"/>
+          <w:sz w:val="28"/>
+        </w:rPr>
+        <w:t xml:space="preserve">Когда вложение фактически исполнено, нажмите </w:t>
+      </w:r>
+      <w:r>
+        <w:rPr>
+          <w:rFonts w:ascii="Times New Roman" w:hAnsi="Times New Roman" w:cs="Times New Roman" w:eastAsia="Times New Roman"/>
+          <w:b/>
+          <w:i w:val="0"/>
+          <w:color w:val="000000"/>
+          <w:sz w:val="28"/>
+        </w:rPr>
+        <w:t>«Отметить исполнение»</w:t>
+      </w:r>
+      <w:r>
+        <w:rPr>
+          <w:rFonts w:ascii="Times New Roman" w:hAnsi="Times New Roman" w:cs="Times New Roman" w:eastAsia="Times New Roman"/>
+          <w:b w:val="0"/>
+          <w:i w:val="0"/>
+          <w:color w:val="000000"/>
+          <w:sz w:val="28"/>
+        </w:rPr>
+        <w:t xml:space="preserve">. </w:t>
+      </w:r>
+      <w:r>
+        <w:rPr>
+          <w:rFonts w:ascii="Times New Roman" w:hAnsi="Times New Roman" w:cs="Times New Roman" w:eastAsia="Times New Roman"/>
+          <w:b/>
+          <w:i w:val="0"/>
+          <w:color w:val="000000"/>
+          <w:sz w:val="28"/>
+        </w:rPr>
+        <w:t>Появится сообщение «Вложение отмечено исполненным».</w:t>
+      </w:r>
+      <w:r>
+        <w:rPr>
+          <w:rFonts w:ascii="Times New Roman" w:hAnsi="Times New Roman" w:cs="Times New Roman" w:eastAsia="Times New Roman"/>
+          <w:b w:val="0"/>
+          <w:i w:val="0"/>
+          <w:color w:val="000000"/>
+          <w:sz w:val="28"/>
+        </w:rPr>
+        <w:t xml:space="preserve"> Это отдельная отметка: она не заменяет вход или выход в таблице поста и не включает фильтр </w:t>
+      </w:r>
+      <w:r>
+        <w:rPr>
+          <w:rFonts w:ascii="Times New Roman" w:hAnsi="Times New Roman" w:cs="Times New Roman" w:eastAsia="Times New Roman"/>
+          <w:b/>
+          <w:i w:val="0"/>
+          <w:color w:val="000000"/>
+          <w:sz w:val="28"/>
+        </w:rPr>
+        <w:t>«Завершённые»</w:t>
+      </w:r>
+      <w:r>
+        <w:rPr>
+          <w:rFonts w:ascii="Times New Roman" w:hAnsi="Times New Roman" w:cs="Times New Roman" w:eastAsia="Times New Roman"/>
+          <w:b w:val="0"/>
+          <w:i w:val="0"/>
+          <w:color w:val="000000"/>
+          <w:sz w:val="28"/>
+        </w:rPr>
+        <w:t xml:space="preserve">. Если после открытия карточки список скрылся, вернитесь к нему кнопкой </w:t>
+      </w:r>
+      <w:r>
+        <w:rPr>
+          <w:rFonts w:ascii="Times New Roman" w:hAnsi="Times New Roman" w:cs="Times New Roman" w:eastAsia="Times New Roman"/>
+          <w:b/>
+          <w:i w:val="0"/>
+          <w:color w:val="000000"/>
+          <w:sz w:val="28"/>
+        </w:rPr>
+        <w:t>«К списку»</w:t>
+      </w:r>
+      <w:r>
+        <w:rPr>
+          <w:rFonts w:ascii="Times New Roman" w:hAnsi="Times New Roman" w:cs="Times New Roman" w:eastAsia="Times New Roman"/>
+          <w:b w:val="0"/>
+          <w:i w:val="0"/>
+          <w:color w:val="000000"/>
+          <w:sz w:val="28"/>
+        </w:rPr>
+        <w:t>.</w:t>
       </w:r>
     </w:p>
     <w:p>
@@ -12093,6 +12237,89 @@
                 <w:sz w:val="24"/>
               </w:rPr>
               <w:t>Обновлены шаги работы на узком экране, запуск и восстановление обучения охранника.</w:t>
+            </w:r>
+          </w:p>
+        </w:tc>
+        <w:tc>
+          <w:tcPr>
+            <w:tcW w:type="dxa" w:w="850"/>
+          </w:tcPr>
+          <w:p>
+            <w:pPr>
+              <w:spacing w:line="240" w:lineRule="auto" w:after="0"/>
+              <w:ind w:firstLine="0"/>
+              <w:jc w:val="left"/>
+            </w:pPr>
+          </w:p>
+        </w:tc>
+      </w:tr>
+      <w:tr>
+        <w:trPr>
+          <w:cantSplit w:val="true"/>
+        </w:trPr>
+        <w:tc>
+          <w:tcPr>
+            <w:tcW w:type="dxa" w:w="1134"/>
+          </w:tcPr>
+          <w:p>
+            <w:pPr>
+              <w:spacing w:line="240" w:lineRule="auto" w:after="0"/>
+              <w:ind w:firstLine="0"/>
+              <w:jc w:val="left"/>
+            </w:pPr>
+            <w:r>
+              <w:rPr>
+                <w:rFonts w:ascii="Times New Roman" w:hAnsi="Times New Roman" w:cs="Times New Roman" w:eastAsia="Times New Roman"/>
+                <w:b w:val="0"/>
+                <w:i w:val="0"/>
+                <w:color w:val="000000"/>
+                <w:sz w:val="24"/>
+              </w:rPr>
+              <w:t>1.5</w:t>
+            </w:r>
+          </w:p>
+        </w:tc>
+        <w:tc>
+          <w:tcPr>
+            <w:tcW w:type="dxa" w:w="1701"/>
+          </w:tcPr>
+          <w:p>
+            <w:pPr>
+              <w:spacing w:line="240" w:lineRule="auto" w:after="0"/>
+              <w:ind w:firstLine="0"/>
+              <w:jc w:val="left"/>
+            </w:pPr>
+            <w:r>
+              <w:rPr>
+                <w:rFonts w:ascii="Times New Roman" w:hAnsi="Times New Roman" w:cs="Times New Roman" w:eastAsia="Times New Roman"/>
+                <w:b w:val="0"/>
+                <w:i w:val="0"/>
+                <w:color w:val="000000"/>
+                <w:sz w:val="24"/>
+              </w:rPr>
+              <w:t>30.10.2026</w:t>
+            </w:r>
+          </w:p>
+        </w:tc>
+        <w:tc>
+          <w:tcPr>
+            <w:tcW w:type="dxa" w:w="5669"/>
+          </w:tcPr>
+          <w:p>
+            <w:pPr>
+              <w:spacing w:line="240" w:lineRule="auto" w:after="0"/>
+              <w:ind w:firstLine="0"/>
+              <w:jc w:val="left"/>
+            </w:pPr>
+            <w:r>
+              <w:rPr>
+                <w:rFonts w:ascii="Times New Roman" w:hAnsi="Times New Roman" w:cs="Times New Roman" w:eastAsia="Times New Roman"/>
+                <w:b w:val="0"/>
+                <w:i w:val="0"/>
+                <w:color w:val="000000"/>
+                <w:sz w:val="24"/>
+              </w:rPr>
+              <w:t>Добавлены действия для открытия доступного журнала поста и отметки исполнения вложения, уточнён возврат к списку.</w:t>
             </w:r>
           </w:p>
         </w:tc>

</xml_diff>